<commit_message>
Agrega bibliografia APA del Bloque II (Neumologia y Medicina Critica) al temario
Cubre los 4 clusteres (enfermedad respiratoria cronica, infecciones
respiratorias, insuficiencia respiratoria/ventilacion, cuidados criticos
y reanimacion) con 18 referencias, priorizando la guia vigente mas
reciente de cada tema (GOLD/GINA 2026, ATS CAP 2025-2026, ARDS ATS 2024
y ESICM 2023, AHA ACLS 2025, entre otras).

Tambien ignora los archivos de bloqueo temporal de Word (~$*.docx) para
que no se cuelen en el control de versiones al abrir el documento.
</commit_message>
<xml_diff>
--- a/Temario Holistico Medicina Interna.docx
+++ b/Temario Holistico Medicina Interna.docx
@@ -2195,7 +2195,7 @@
         <w:pStyle w:val="Intro"/>
       </w:pPr>
       <w:r>
-        <w:t xml:space="preserve">Bibliografía en formato APA (7.ª edición), organizada siguiendo la misma jerarquía del temario (bloque &gt; clúster). Se prioriza la guía o el consenso vigente más reciente de cada tema. Esta sección se irá completando de forma progresiva; por ahora incluye el bloque completo de Sistema Cardiovascular, para revisión.</w:t>
+        <w:t xml:space="preserve">Bibliografía en formato APA (7.ª edición), organizada siguiendo la misma jerarquía del temario (bloque &gt; clúster). Se prioriza la guía o el consenso vigente más reciente de cada tema. Esta sección se irá completando de forma progresiva; por ahora incluye los bloques completos de Sistema Cardiovascular y Neumología y Medicina Crítica, para revisión.</w:t>
       </w:r>
     </w:p>
     <w:p>
@@ -2400,10 +2400,194 @@
     </w:p>
     <w:p>
       <w:pPr>
+        <w:pStyle w:val="Heading2"/>
+      </w:pPr>
+      <w:r>
+        <w:t xml:space="preserve">II. Neumología y Medicina Crítica</w:t>
+      </w:r>
+    </w:p>
+    <w:p>
+      <w:pPr>
+        <w:pStyle w:val="Heading3"/>
+      </w:pPr>
+      <w:r>
+        <w:t xml:space="preserve">Enfermedad respiratoria crónica</w:t>
+      </w:r>
+    </w:p>
+    <w:p>
+      <w:pPr>
+        <w:pStyle w:val="APARef"/>
+      </w:pPr>
+      <w:r>
+        <w:t xml:space="preserve">Global Initiative for Chronic Obstructive Lung Disease. (2026). Global strategy for the diagnosis, management, and prevention of chronic obstructive pulmonary disease: 2026 report. https://goldcopd.org/2026-gold-report-and-pocket-guide/</w:t>
+      </w:r>
+    </w:p>
+    <w:p>
+      <w:pPr>
+        <w:pStyle w:val="APARef"/>
+      </w:pPr>
+      <w:r>
+        <w:t xml:space="preserve">Global Initiative for Asthma. (2026). Global strategy for asthma management and prevention: 2026 update. https://ginasthma.org/2026-gina-strategy-report/</w:t>
+      </w:r>
+    </w:p>
+    <w:p>
+      <w:pPr>
+        <w:pStyle w:val="APARef"/>
+      </w:pPr>
+      <w:r>
+        <w:t xml:space="preserve">Raghu, G., Remy-Jardin, M., Myers, J. L., et al. (2022). Idiopathic pulmonary fibrosis (an update) and progressive pulmonary fibrosis in adults: An official ATS/ERS/JRS/ALAT clinical practice guideline. American Journal of Respiratory and Critical Care Medicine, 205(9), e18–e47. https://doi.org/10.1164/rccm.202202-0399ST</w:t>
+      </w:r>
+    </w:p>
+    <w:p>
+      <w:pPr>
+        <w:pStyle w:val="APARef"/>
+      </w:pPr>
+      <w:r>
+        <w:t xml:space="preserve">Humbert, M., Kovacs, G., Hoeper, M. M., et al. (2022). 2022 ESC/ERS Guidelines for the diagnosis and treatment of pulmonary hypertension. European Heart Journal, 43(38), 3618–3731. https://doi.org/10.1093/eurheartj/ehac237</w:t>
+      </w:r>
+    </w:p>
+    <w:p>
+      <w:pPr>
+        <w:pStyle w:val="Heading3"/>
+      </w:pPr>
+      <w:r>
+        <w:t xml:space="preserve">Infecciones respiratorias</w:t>
+      </w:r>
+    </w:p>
+    <w:p>
+      <w:pPr>
+        <w:pStyle w:val="APARef"/>
+      </w:pPr>
+      <w:r>
+        <w:t xml:space="preserve">Jones, B. E., Ramirez, J. A., Restrepo, M. I., et al. (2026). Diagnosis and management of community-acquired pneumonia: An official American Thoracic Society clinical practice guideline. American Journal of Respiratory and Critical Care Medicine, 212(1), 24–44. https://doi.org/10.1164/rccm.202507-1692ST</w:t>
+      </w:r>
+    </w:p>
+    <w:p>
+      <w:pPr>
+        <w:pStyle w:val="APARef"/>
+      </w:pPr>
+      <w:r>
+        <w:t xml:space="preserve">Kalil, A. C., Metersky, M. L., Klompas, M., et al. (2016). Management of adults with hospital-acquired and ventilator-associated pneumonia: 2016 clinical practice guidelines by the Infectious Diseases Society of America and the American Thoracic Society. Clinical Infectious Diseases, 63(5), e61–e111. https://doi.org/10.1093/cid/ciw353</w:t>
+      </w:r>
+    </w:p>
+    <w:p>
+      <w:pPr>
+        <w:pStyle w:val="APARef"/>
+      </w:pPr>
+      <w:r>
+        <w:t xml:space="preserve">Nahid, P., Dorman, S. E., Alipanah, N., et al. (2016). Official American Thoracic Society/Centers for Disease Control and Prevention/Infectious Diseases Society of America clinical practice guidelines: Treatment of drug-susceptible tuberculosis. Clinical Infectious Diseases, 63(7), e147–e195.</w:t>
+      </w:r>
+    </w:p>
+    <w:p>
+      <w:pPr>
+        <w:pStyle w:val="APARef"/>
+      </w:pPr>
+      <w:r>
+        <w:t xml:space="preserve">World Health Organization. (2022). WHO consolidated guidelines on tuberculosis. Module 4: Treatment — drug-resistant tuberculosis treatment, 2022 update. https://www.who.int/publications/i/item/9789240063129</w:t>
+      </w:r>
+    </w:p>
+    <w:p>
+      <w:pPr>
+        <w:pStyle w:val="Heading3"/>
+      </w:pPr>
+      <w:r>
+        <w:t xml:space="preserve">Insuficiencia respiratoria y ventilación</w:t>
+      </w:r>
+    </w:p>
+    <w:p>
+      <w:pPr>
+        <w:pStyle w:val="APARef"/>
+      </w:pPr>
+      <w:r>
+        <w:t xml:space="preserve">Qadir, N., Sahetya, S., Munshi, L., et al. (2024). An update on management of adult patients with acute respiratory distress syndrome: An official American Thoracic Society clinical practice guideline. American Journal of Respiratory and Critical Care Medicine, 209(1), 24–36. https://doi.org/10.1164/rccm.202311-2011ST</w:t>
+      </w:r>
+    </w:p>
+    <w:p>
+      <w:pPr>
+        <w:pStyle w:val="APARef"/>
+      </w:pPr>
+      <w:r>
+        <w:t xml:space="preserve">Grasselli, G., Calfee, C. S., Camporota, L., et al. (2023). ESICM guidelines on acute respiratory distress syndrome: Definition, phenotyping and respiratory support strategies. Intensive Care Medicine, 49(7), 727–759. https://doi.org/10.1007/s00134-023-07050-7</w:t>
+      </w:r>
+    </w:p>
+    <w:p>
+      <w:pPr>
+        <w:pStyle w:val="APARef"/>
+      </w:pPr>
+      <w:r>
+        <w:t xml:space="preserve">Girard, T. D., Alhazzani, W., Kress, J. P., et al. (2017). An official American Thoracic Society/American College of Chest Physicians clinical practice guideline: Liberation from mechanical ventilation in critically ill adults. Rehabilitation protocols, ventilator liberation protocols, and cuff leak tests. American Journal of Respiratory and Critical Care Medicine, 195(1), 120–133. https://doi.org/10.1164/rccm.201610-2075ST</w:t>
+      </w:r>
+    </w:p>
+    <w:p>
+      <w:pPr>
+        <w:pStyle w:val="APARef"/>
+      </w:pPr>
+      <w:r>
+        <w:t xml:space="preserve">BTS Pleural Guideline Development Group. (2023). British Thoracic Society guideline for pleural disease. Thorax, 78(Suppl 3), 1–s42. https://doi.org/10.1136/thorax-2022-219784</w:t>
+      </w:r>
+    </w:p>
+    <w:p>
+      <w:pPr>
+        <w:pStyle w:val="Heading3"/>
+      </w:pPr>
+      <w:r>
+        <w:t xml:space="preserve">Cuidados críticos y reanimación</w:t>
+      </w:r>
+    </w:p>
+    <w:p>
+      <w:pPr>
+        <w:pStyle w:val="APARef"/>
+      </w:pPr>
+      <w:r>
+        <w:t xml:space="preserve">Singer, M., Deutschman, C. S., Seymour, C. W., et al. (2016). The Third International Consensus Definitions for Sepsis and Septic Shock (Sepsis-3). JAMA, 315(8), 801–810.</w:t>
+      </w:r>
+    </w:p>
+    <w:p>
+      <w:pPr>
+        <w:pStyle w:val="APARef"/>
+      </w:pPr>
+      <w:r>
+        <w:t xml:space="preserve">Prescott, H. C., Antonelli, M., Alhazzani, W., et al. (2026). Surviving Sepsis Campaign: International guidelines for management of sepsis and septic shock 2026. Critical Care Medicine, 54(4), 725–812.</w:t>
+      </w:r>
+    </w:p>
+    <w:p>
+      <w:pPr>
+        <w:pStyle w:val="APARef"/>
+      </w:pPr>
+      <w:r>
+        <w:t xml:space="preserve">Ranzani, O. T., Singer, M., Salluh, J. I. F., et al. (2025). Development and validation of the Sequential Organ Failure Assessment (SOFA)-2 score. JAMA, 334(23), 2090–2103.</w:t>
+      </w:r>
+    </w:p>
+    <w:p>
+      <w:pPr>
+        <w:pStyle w:val="APARef"/>
+      </w:pPr>
+      <w:r>
+        <w:t xml:space="preserve">Devlin, J. W., Skrobik, Y., Gélinas, C., et al. (2018). Clinical practice guidelines for the prevention and management of pain, agitation/sedation, withdrawal, and delirium in adult critically ill patients (PADIS). Critical Care Medicine, 46(9), e825–e873.</w:t>
+      </w:r>
+    </w:p>
+    <w:p>
+      <w:pPr>
+        <w:pStyle w:val="APARef"/>
+      </w:pPr>
+      <w:r>
+        <w:t xml:space="preserve">Murray, M. J., DeBlock, H., Erstad, B., et al. (2016). Clinical practice guidelines for sustained neuromuscular blockade in the adult critically ill patient. Critical Care Medicine, 44(11), 2079–2103.</w:t>
+      </w:r>
+    </w:p>
+    <w:p>
+      <w:pPr>
+        <w:pStyle w:val="APARef"/>
+      </w:pPr>
+      <w:r>
+        <w:t xml:space="preserve">Wigginton, J. G., Kurz, M. C., et al. (2025). Part 9: Adult advanced life support: 2025 American Heart Association guidelines for cardiopulmonary resuscitation and emergency cardiovascular care. Circulation, 152(16), S538–S577. https://doi.org/10.1161/CIR.0000000000001376</w:t>
+      </w:r>
+    </w:p>
+    <w:p>
+      <w:pPr>
         <w:pStyle w:val="PendingNote"/>
       </w:pPr>
       <w:r>
-        <w:t xml:space="preserve">Los bloques II a XIV quedan pendientes de bibliografía y se agregarán en próximas revisiones.</w:t>
+        <w:t xml:space="preserve">Los bloques III a XIV quedan pendientes de bibliografía y se agregarán en próximas revisiones.</w:t>
       </w:r>
     </w:p>
     <w:p>

</xml_diff>